<commit_message>
March 29, 2025 Update
</commit_message>
<xml_diff>
--- a/MazeRunner_Spec.docx
+++ b/MazeRunner_Spec.docx
@@ -22,7 +22,7 @@
     </w:p>
     <w:p>
       <w:r>
-        <w:t>Updated to reflect the implemented standalone app scope as of March 26, 2026</w:t>
+        <w:t>Updated to reflect the implemented standalone app scope as of March 29, 2026</w:t>
       </w:r>
     </w:p>
     <w:p/>
@@ -131,7 +131,7 @@
               <w:pStyle w:val="NoSpacing"/>
             </w:pPr>
             <w:r>
-              <w:t>2.3</w:t>
+              <w:t>2.5</w:t>
             </w:r>
           </w:p>
         </w:tc>
@@ -159,7 +159,7 @@
               <w:pStyle w:val="NoSpacing"/>
             </w:pPr>
             <w:r>
-              <w:t>March 26, 2026</w:t>
+              <w:t>March 29, 2026</w:t>
             </w:r>
           </w:p>
         </w:tc>
@@ -2377,7 +2377,7 @@
     </w:p>
     <w:p>
       <w:r>
-        <w:t>Fantasy mode introduces a spell tier system with eight backlash penalty effects that disrupt the interface when triggered. Each effect is a full-screen interactive overlay that the user must dismiss before continuing. The current backlash effects are:</w:t>
+        <w:t>Fantasy mode introduces a spell tier system with backlash penalty effects that disrupt the interface when triggered. Each effect is a full-screen interactive overlay that the user must dismiss before continuing. All other timers (spell scheduling, session timeouts, inactivity timers) are paused while a backlash effect is active and resume once the effect concludes. The authored backlash catalog is listed below. In the current live testing configuration, the random fantasy backlash pool is intentionally limited to Wraith and Gelatinous Cube, while explicit effectType overrides remain available for diagnostics and automated verification.</w:t>
       </w:r>
     </w:p>
     <w:p>
@@ -2417,7 +2417,7 @@
         <w:pStyle w:val="ListParagraph"/>
       </w:pPr>
       <w:r>
-        <w:t>- Living Scroll: an animated parchment scroll unfurls with lore text that must be read and dismissed.</w:t>
+        <w:t>- Living Scroll: an animated parchment scroll unfurls with lore text. The anchor glyph used to dismiss it dodges to a random screen position on the first two clicks, requiring three total clicks to dispel.</w:t>
       </w:r>
     </w:p>
     <w:p>
@@ -2446,6 +2446,22 @@
     </w:p>
     <w:p>
       <w:pPr>
+        <w:pStyle w:val="ListParagraph"/>
+      </w:pPr>
+      <w:r>
+        <w:t>- Wraith: a multi-phase cinematic encounter. Phase 1 applies a ghostly trailing effect via backdrop-filter for five seconds. Phase 2 flickers the screen, dims it, and fades to black. After a two-second linger on the black screen, a poem appears slowly line by line in red italic lettering. When the poem concludes, the darkness fades back into the ghostly backdrop and the wraith shimmers into view to begin the fight. The cursor becomes a sword only once combat starts, and damage is ignored before the engagement is active. The wraith requires three hits to slay; after each intermediate hit it fades out and reappears at a random position on screen. After the third hit the wraith fades, the trailing effect clears, and the screen returns to normal for five seconds before a full-screen jumpscare image of the wraith?s face fills the screen against an alternating black-and-red background, shaking for two seconds before vanishing. Uses Wraith and Wraith Face visual assets.</w:t>
+      </w:r>
+    </w:p>
+    <w:p>
+      <w:pPr>
+        <w:pStyle w:val="ListParagraph"/>
+      </w:pPr>
+      <w:r>
+        <w:t>- Gelatinous Cube: a large translucent cube now starts fully offscreen, then oozes through the viewport on four sweeping passes (header sweep, mid sweep, bottom-left to top-right, and top-right to center), leaving a fading slime trail behind it. As it passes over visible interface affordances, buttons, nav items, chips, inline actions, and icon-like controls disappear from the page and reappear inside the cube as miniature styled fragments that more closely match the original captured elements. A translucent slime layer and silhouette mask keep those controls looking suspended inside the cube rather than pasted onto a rectangular plate. The system tops the capture set up to eighteen visible affordances when available. After completing all four paths, the cube stops at center and the cursor becomes a sword. Three hits are required to kill the cube; each hit triggers a shudder animation. Upon death, all captured controls are restored to their original positions. Uses the Gelatinous Cube visual asset.</w:t>
+      </w:r>
+    </w:p>
+    <w:p>
+      <w:pPr>
         <w:pStyle w:val="Heading3"/>
       </w:pPr>
       <w:r>
@@ -2454,7 +2470,43 @@
     </w:p>
     <w:p>
       <w:r>
-        <w:t>Spell interactions are organized into five tiers: Cantrip, Ward, Hex, Ritual, and Grand Conjuration. Each tier escalates in visual intensity and disruption. The spell tier determines which backlash effects can be triggered and their duration or severity. Higher-tier spells produce more dramatic backlash effects.</w:t>
+        <w:t>Spell interactions are organized into five tiers: Cantrip, Ward, Hex, Ritual, and Grand Conjuration. Each tier escalates in visual intensity and disruption. In the full authored design, tier determines which backlash effects can be surfaced and how severe they become. In the current testing configuration, the live random backlash pool is intentionally narrowed to Wraith and Gelatinous Cube, so tier primarily changes cadence and disruption severity while explicit effect overrides remain available for diagnostics. Higher-tier spells still produce more dramatic backlash presentations.</w:t>
+      </w:r>
+    </w:p>
+    <w:p>
+      <w:pPr>
+        <w:pStyle w:val="Heading3"/>
+      </w:pPr>
+      <w:r>
+        <w:t>5.2.3 Interrupt Challenge System</w:t>
+      </w:r>
+    </w:p>
+    <w:p>
+      <w:r>
+        <w:t>The spell system has been generalized into an Interrupt Challenge system that extends to non-fantasy friction modes. In fantasy mode, the system operates identically to the original spell mechanic with full backlash effects and escalating tiers that cap at the highest level. In non-fantasy modes, the system is controlled by the interruptChallenges parameter on each friction profile, and the behavior differs in two key ways: tiers cycle rather than escalate (e.g., Balanced cycles through Quick Check and Verification repeatedly), and backlash effects are disabled.</w:t>
+      </w:r>
+    </w:p>
+    <w:p>
+      <w:r>
+        <w:t>All UI text is dual-tracked with enterprise-appropriate theming for non-fantasy modes. Fantasy tier labels (Cantrip, Ward, Hex, Ritual, Grand Conjuration) map to enterprise equivalents (Quick Check, Verification, Compliance Audit, Security Review, Full Compliance Review). Titles, prompts, grimoire content, rune selections, phantom popups, pact banners, and toast messages all have enterprise variants using language such as session timeouts, MFA verification, compliance audits, and terms of service acceptance.</w:t>
+      </w:r>
+    </w:p>
+    <w:p>
+      <w:r>
+        <w:t>The friction profile parameters controlling interrupt challenges are: interruptChallenges (false, “light”, “moderate”, or “full”), interruptMaxTier (0–5), and interruptIntervalMs (milliseconds between challenges). Guided mode has challenges disabled. Balanced enables light challenges with two tiers at 105-second intervals. Realistic enables moderate challenges with four tiers at 60-second intervals. Adversarial enables full challenges with all five tiers at 45-second intervals.</w:t>
+      </w:r>
+    </w:p>
+    <w:p>
+      <w:pPr>
+        <w:pStyle w:val="Heading3"/>
+      </w:pPr>
+      <w:r>
+        <w:t>5.2.4 Timer Coordination During Backlash</w:t>
+      </w:r>
+    </w:p>
+    <w:p>
+      <w:r>
+        <w:t>When a backlash effect triggers, the system pauses all competing timers: the next spell cast timer, the session inactivity timeout, the session warning countdown, and any active session timeout modal is dismissed. A backlashActive flag on the application state prevents new spell scheduling while an effect is in progress. When the backlash effect concludes (the penalty host element is pruned from the DOM), all paused timers are resumed: the next spell is rescheduled using the friction profile’s interval, and the session inactivity timeout is re-armed using the friction profile’s session timeout setting.</w:t>
       </w:r>
     </w:p>
     <w:p>
@@ -2884,7 +2936,7 @@
     </w:p>
     <w:p>
       <w:r>
-        <w:t>Friction modes currently exposed are Guided, Balanced, Realistic or Operational, and Adversarial. These modes shape overlays, ambient interruptions, misleading search behavior, time pressure, and other benchmark nuisances.</w:t>
+        <w:t>Friction modes currently exposed are Guided, Balanced, Realistic or Operational, and Adversarial. These modes shape overlays, ambient interruptions, misleading search behavior, time pressure, interrupt challenges, and other benchmark nuisances. Each friction profile now includes interrupt challenge parameters (interruptChallenges, interruptMaxTier, interruptIntervalMs) that control timed workflow interruptions at varying intensities, as described in section 5.2.3.</w:t>
       </w:r>
     </w:p>
     <w:p>

</xml_diff>